<commit_message>
v0.1: MVP - sync LLM call, in-memory storage
</commit_message>
<xml_diff>
--- a/careplan.docx
+++ b/careplan.docx
@@ -39,6 +39,9 @@
     </w:p>
     <w:p>
       <w:r>
+        <w:rPr>
+          <w:noProof/>
+        </w:rPr>
         <w:drawing>
           <wp:inline distT="0" distB="0" distL="0" distR="0" wp14:anchorId="2E8A2786" wp14:editId="051B1C4C">
             <wp:extent cx="3490262" cy="3063505"/>
@@ -105,67 +108,61 @@
       </w:r>
     </w:p>
     <w:p>
+      <w:r>
+        <w:rPr>
+          <w:rFonts w:hint="eastAsia"/>
+        </w:rPr>
+        <w:t xml:space="preserve">3 </w:t>
+      </w:r>
+      <w:r>
+        <w:t>Warning if orders look like duplicates</w:t>
+      </w:r>
+      <w:proofErr w:type="gramStart"/>
+      <w:r>
+        <w:rPr>
+          <w:rFonts w:hint="eastAsia"/>
+        </w:rPr>
+        <w:t xml:space="preserve">   (</w:t>
+      </w:r>
+      <w:proofErr w:type="gramEnd"/>
+      <w:r>
+        <w:rPr>
+          <w:rFonts w:hint="eastAsia"/>
+          <w:color w:val="FF0000"/>
+        </w:rPr>
+        <w:t>define duplicate?</w:t>
+      </w:r>
+      <w:r>
+        <w:rPr>
+          <w:rFonts w:hint="eastAsia"/>
+          <w:color w:val="FF0000"/>
+        </w:rPr>
+        <w:t xml:space="preserve"> </w:t>
+      </w:r>
+      <w:r>
+        <w:rPr>
+          <w:color w:val="FF0000"/>
+        </w:rPr>
+        <w:t>A</w:t>
+      </w:r>
+      <w:r>
+        <w:rPr>
+          <w:rFonts w:hint="eastAsia"/>
+          <w:color w:val="FF0000"/>
+        </w:rPr>
+        <w:t>fter warning?</w:t>
+      </w:r>
+      <w:r>
+        <w:rPr>
+          <w:rFonts w:hint="eastAsia"/>
+          <w:color w:val="FF0000"/>
+        </w:rPr>
+        <w:t>)</w:t>
+      </w:r>
+    </w:p>
+    <w:p>
       <w:pPr>
         <w:rPr>
-          <w:rFonts w:hint="eastAsia"/>
-        </w:rPr>
-      </w:pPr>
-      <w:r>
-        <w:rPr>
-          <w:rFonts w:hint="eastAsia"/>
-        </w:rPr>
-        <w:t xml:space="preserve">3 </w:t>
-      </w:r>
-      <w:r>
-        <w:t>Warning if orders look like duplicates</w:t>
-      </w:r>
-      <w:proofErr w:type="gramStart"/>
-      <w:r>
-        <w:rPr>
-          <w:rFonts w:hint="eastAsia"/>
-        </w:rPr>
-        <w:t xml:space="preserve">   (</w:t>
-      </w:r>
-      <w:proofErr w:type="gramEnd"/>
-      <w:r>
-        <w:rPr>
-          <w:rFonts w:hint="eastAsia"/>
-          <w:color w:val="FF0000"/>
-        </w:rPr>
-        <w:t>define duplicate?</w:t>
-      </w:r>
-      <w:r>
-        <w:rPr>
-          <w:rFonts w:hint="eastAsia"/>
-          <w:color w:val="FF0000"/>
-        </w:rPr>
-        <w:t xml:space="preserve"> </w:t>
-      </w:r>
-      <w:r>
-        <w:rPr>
-          <w:color w:val="FF0000"/>
-        </w:rPr>
-        <w:t>A</w:t>
-      </w:r>
-      <w:r>
-        <w:rPr>
-          <w:rFonts w:hint="eastAsia"/>
-          <w:color w:val="FF0000"/>
-        </w:rPr>
-        <w:t>fter warning?</w:t>
-      </w:r>
-      <w:r>
-        <w:rPr>
-          <w:rFonts w:hint="eastAsia"/>
-          <w:color w:val="FF0000"/>
-        </w:rPr>
-        <w:t>)</w:t>
-      </w:r>
-    </w:p>
-    <w:p>
-      <w:pPr>
-        <w:rPr>
-          <w:rFonts w:hint="eastAsia"/>
           <w:color w:val="FF0000"/>
         </w:rPr>
       </w:pPr>
@@ -286,6 +283,224 @@
           <w:rFonts w:hint="eastAsia"/>
         </w:rPr>
       </w:pPr>
+      <w:r>
+        <w:rPr>
+          <w:rFonts w:hint="eastAsia"/>
+        </w:rPr>
+        <w:t xml:space="preserve"># </w:t>
+      </w:r>
+      <w:r>
+        <w:rPr>
+          <w:rFonts w:hint="eastAsia"/>
+        </w:rPr>
+        <w:t>每次改完代码，三步走：</w:t>
+      </w:r>
+    </w:p>
+    <w:p>
+      <w:pPr>
+        <w:rPr>
+          <w:rFonts w:hint="eastAsia"/>
+        </w:rPr>
+      </w:pPr>
+      <w:r>
+        <w:rPr>
+          <w:rFonts w:hint="eastAsia"/>
+        </w:rPr>
+        <w:t xml:space="preserve">git </w:t>
+      </w:r>
+      <w:proofErr w:type="gramStart"/>
+      <w:r>
+        <w:rPr>
+          <w:rFonts w:hint="eastAsia"/>
+        </w:rPr>
+        <w:t>add .</w:t>
+      </w:r>
+      <w:proofErr w:type="gramEnd"/>
+      <w:r>
+        <w:rPr>
+          <w:rFonts w:hint="eastAsia"/>
+        </w:rPr>
+        <w:t xml:space="preserve">                        # </w:t>
+      </w:r>
+      <w:r>
+        <w:rPr>
+          <w:rFonts w:hint="eastAsia"/>
+        </w:rPr>
+        <w:t>暂存改动</w:t>
+      </w:r>
+    </w:p>
+    <w:p>
+      <w:pPr>
+        <w:rPr>
+          <w:rFonts w:hint="eastAsia"/>
+        </w:rPr>
+      </w:pPr>
+      <w:r>
+        <w:rPr>
+          <w:rFonts w:hint="eastAsia"/>
+        </w:rPr>
+        <w:t xml:space="preserve">git commit -m "feat: </w:t>
+      </w:r>
+      <w:r>
+        <w:rPr>
+          <w:rFonts w:hint="eastAsia"/>
+        </w:rPr>
+        <w:t>加了</w:t>
+      </w:r>
+      <w:r>
+        <w:rPr>
+          <w:rFonts w:hint="eastAsia"/>
+        </w:rPr>
+        <w:t>XX</w:t>
+      </w:r>
+      <w:r>
+        <w:rPr>
+          <w:rFonts w:hint="eastAsia"/>
+        </w:rPr>
+        <w:t>功能</w:t>
+      </w:r>
+      <w:r>
+        <w:rPr>
+          <w:rFonts w:hint="eastAsia"/>
+        </w:rPr>
+        <w:t xml:space="preserve">"   # </w:t>
+      </w:r>
+      <w:r>
+        <w:rPr>
+          <w:rFonts w:hint="eastAsia"/>
+        </w:rPr>
+        <w:t>提交到本地</w:t>
+      </w:r>
+    </w:p>
+    <w:p>
+      <w:pPr>
+        <w:rPr>
+          <w:rFonts w:hint="eastAsia"/>
+        </w:rPr>
+      </w:pPr>
+      <w:r>
+        <w:rPr>
+          <w:rFonts w:hint="eastAsia"/>
+        </w:rPr>
+        <w:t xml:space="preserve">git push                         # </w:t>
+      </w:r>
+      <w:r>
+        <w:rPr>
+          <w:rFonts w:hint="eastAsia"/>
+        </w:rPr>
+        <w:t>推送到</w:t>
+      </w:r>
+      <w:r>
+        <w:rPr>
+          <w:rFonts w:hint="eastAsia"/>
+        </w:rPr>
+        <w:t xml:space="preserve"> GitHub</w:t>
+      </w:r>
+    </w:p>
+    <w:p/>
+    <w:p>
+      <w:pPr>
+        <w:rPr>
+          <w:rFonts w:hint="eastAsia"/>
+        </w:rPr>
+      </w:pPr>
+      <w:r>
+        <w:rPr>
+          <w:rFonts w:hint="eastAsia"/>
+        </w:rPr>
+        <w:t xml:space="preserve"># </w:t>
+      </w:r>
+      <w:r>
+        <w:rPr>
+          <w:rFonts w:hint="eastAsia"/>
+        </w:rPr>
+        <w:t>其他常用命令</w:t>
+      </w:r>
+    </w:p>
+    <w:p>
+      <w:pPr>
+        <w:rPr>
+          <w:rFonts w:hint="eastAsia"/>
+        </w:rPr>
+      </w:pPr>
+      <w:r>
+        <w:rPr>
+          <w:rFonts w:hint="eastAsia"/>
+        </w:rPr>
+        <w:t xml:space="preserve">git status                       # </w:t>
+      </w:r>
+      <w:r>
+        <w:rPr>
+          <w:rFonts w:hint="eastAsia"/>
+        </w:rPr>
+        <w:t>看当前状态</w:t>
+      </w:r>
+    </w:p>
+    <w:p>
+      <w:pPr>
+        <w:rPr>
+          <w:rFonts w:hint="eastAsia"/>
+        </w:rPr>
+      </w:pPr>
+      <w:r>
+        <w:rPr>
+          <w:rFonts w:hint="eastAsia"/>
+        </w:rPr>
+        <w:t>git log --</w:t>
+      </w:r>
+      <w:proofErr w:type="spellStart"/>
+      <w:r>
+        <w:rPr>
+          <w:rFonts w:hint="eastAsia"/>
+        </w:rPr>
+        <w:t>oneline</w:t>
+      </w:r>
+      <w:proofErr w:type="spellEnd"/>
+      <w:r>
+        <w:rPr>
+          <w:rFonts w:hint="eastAsia"/>
+        </w:rPr>
+        <w:t xml:space="preserve">                # </w:t>
+      </w:r>
+      <w:r>
+        <w:rPr>
+          <w:rFonts w:hint="eastAsia"/>
+        </w:rPr>
+        <w:t>看提交历史</w:t>
+      </w:r>
+    </w:p>
+    <w:p>
+      <w:pPr>
+        <w:rPr>
+          <w:rFonts w:hint="eastAsia"/>
+        </w:rPr>
+      </w:pPr>
+      <w:r>
+        <w:rPr>
+          <w:rFonts w:hint="eastAsia"/>
+        </w:rPr>
+        <w:t xml:space="preserve">git diff                         # </w:t>
+      </w:r>
+      <w:r>
+        <w:rPr>
+          <w:rFonts w:hint="eastAsia"/>
+        </w:rPr>
+        <w:t>看改了什么</w:t>
+      </w:r>
+    </w:p>
+    <w:p>
+      <w:r>
+        <w:rPr>
+          <w:rFonts w:hint="eastAsia"/>
+        </w:rPr>
+        <w:t xml:space="preserve">git pull                         # </w:t>
+      </w:r>
+      <w:r>
+        <w:rPr>
+          <w:rFonts w:hint="eastAsia"/>
+        </w:rPr>
+        <w:t>从远程拉取最新代码</w:t>
+      </w:r>
     </w:p>
     <w:sectPr>
       <w:pgSz w:w="11906" w:h="16838"/>
@@ -900,6 +1115,7 @@
   <w:style w:type="character" w:default="1" w:styleId="DefaultParagraphFont">
     <w:name w:val="Default Paragraph Font"/>
     <w:uiPriority w:val="1"/>
+    <w:semiHidden/>
     <w:unhideWhenUsed/>
   </w:style>
   <w:style w:type="table" w:default="1" w:styleId="TableNormal">

</xml_diff>

<commit_message>
feat: upgrade to PostgreSQL with JPA, add status tracking
</commit_message>
<xml_diff>
--- a/careplan.docx
+++ b/careplan.docx
@@ -117,14 +117,12 @@
       <w:r>
         <w:t>Warning if orders look like duplicates</w:t>
       </w:r>
-      <w:proofErr w:type="gramStart"/>
       <w:r>
         <w:rPr>
           <w:rFonts w:hint="eastAsia"/>
         </w:rPr>
         <w:t xml:space="preserve">   (</w:t>
       </w:r>
-      <w:proofErr w:type="gramEnd"/>
       <w:r>
         <w:rPr>
           <w:rFonts w:hint="eastAsia"/>
@@ -173,11 +171,7 @@
         <w:t xml:space="preserve">4 </w:t>
       </w:r>
       <w:r>
-        <w:t xml:space="preserve">Warning if a patient looks like it is </w:t>
-      </w:r>
-      <w:proofErr w:type="gramStart"/>
-      <w:r>
-        <w:t>duplicated</w:t>
+        <w:t>Warning if a patient looks like it is duplicated</w:t>
       </w:r>
       <w:r>
         <w:rPr>
@@ -185,61 +179,12 @@
         </w:rPr>
         <w:t>(</w:t>
       </w:r>
-      <w:proofErr w:type="gramEnd"/>
       <w:r>
         <w:rPr>
           <w:rFonts w:hint="eastAsia"/>
           <w:color w:val="FF0000"/>
         </w:rPr>
-        <w:t xml:space="preserve">either name or NPI is the </w:t>
-      </w:r>
-      <w:proofErr w:type="gramStart"/>
-      <w:r>
-        <w:rPr>
-          <w:rFonts w:hint="eastAsia"/>
-          <w:color w:val="FF0000"/>
-        </w:rPr>
-        <w:t>same</w:t>
-      </w:r>
-      <w:proofErr w:type="gramEnd"/>
-      <w:r>
-        <w:rPr>
-          <w:rFonts w:hint="eastAsia"/>
-          <w:color w:val="FF0000"/>
-        </w:rPr>
-        <w:t xml:space="preserve"> but the other one is </w:t>
-      </w:r>
-      <w:proofErr w:type="gramStart"/>
-      <w:r>
-        <w:rPr>
-          <w:rFonts w:hint="eastAsia"/>
-          <w:color w:val="FF0000"/>
-        </w:rPr>
-        <w:t>not-human</w:t>
-      </w:r>
-      <w:proofErr w:type="gramEnd"/>
-      <w:r>
-        <w:rPr>
-          <w:rFonts w:hint="eastAsia"/>
-          <w:color w:val="FF0000"/>
-        </w:rPr>
-        <w:t xml:space="preserve"> </w:t>
-      </w:r>
-      <w:proofErr w:type="gramStart"/>
-      <w:r>
-        <w:rPr>
-          <w:rFonts w:hint="eastAsia"/>
-          <w:color w:val="FF0000"/>
-        </w:rPr>
-        <w:t>check, and</w:t>
-      </w:r>
-      <w:proofErr w:type="gramEnd"/>
-      <w:r>
-        <w:rPr>
-          <w:rFonts w:hint="eastAsia"/>
-          <w:color w:val="FF0000"/>
-        </w:rPr>
-        <w:t xml:space="preserve"> double confirm then update data.)</w:t>
+        <w:t>either name or NPI is the same but the other one is not-human check, and double confirm then update data.)</w:t>
       </w:r>
     </w:p>
     <w:p>
@@ -278,11 +223,6 @@
     <w:p/>
     <w:p/>
     <w:p>
-      <w:pPr>
-        <w:rPr>
-          <w:rFonts w:hint="eastAsia"/>
-        </w:rPr>
-      </w:pPr>
       <w:r>
         <w:rPr>
           <w:rFonts w:hint="eastAsia"/>
@@ -297,30 +237,11 @@
       </w:r>
     </w:p>
     <w:p>
-      <w:pPr>
-        <w:rPr>
-          <w:rFonts w:hint="eastAsia"/>
-        </w:rPr>
-      </w:pPr>
-      <w:r>
-        <w:rPr>
-          <w:rFonts w:hint="eastAsia"/>
-        </w:rPr>
-        <w:t xml:space="preserve">git </w:t>
-      </w:r>
-      <w:proofErr w:type="gramStart"/>
-      <w:r>
-        <w:rPr>
-          <w:rFonts w:hint="eastAsia"/>
-        </w:rPr>
-        <w:t>add .</w:t>
-      </w:r>
-      <w:proofErr w:type="gramEnd"/>
-      <w:r>
-        <w:rPr>
-          <w:rFonts w:hint="eastAsia"/>
-        </w:rPr>
-        <w:t xml:space="preserve">                        # </w:t>
+      <w:r>
+        <w:rPr>
+          <w:rFonts w:hint="eastAsia"/>
+        </w:rPr>
+        <w:t xml:space="preserve">git add .                        # </w:t>
       </w:r>
       <w:r>
         <w:rPr>
@@ -330,11 +251,6 @@
       </w:r>
     </w:p>
     <w:p>
-      <w:pPr>
-        <w:rPr>
-          <w:rFonts w:hint="eastAsia"/>
-        </w:rPr>
-      </w:pPr>
       <w:r>
         <w:rPr>
           <w:rFonts w:hint="eastAsia"/>
@@ -373,11 +289,6 @@
       </w:r>
     </w:p>
     <w:p>
-      <w:pPr>
-        <w:rPr>
-          <w:rFonts w:hint="eastAsia"/>
-        </w:rPr>
-      </w:pPr>
       <w:r>
         <w:rPr>
           <w:rFonts w:hint="eastAsia"/>
@@ -399,11 +310,6 @@
     </w:p>
     <w:p/>
     <w:p>
-      <w:pPr>
-        <w:rPr>
-          <w:rFonts w:hint="eastAsia"/>
-        </w:rPr>
-      </w:pPr>
       <w:r>
         <w:rPr>
           <w:rFonts w:hint="eastAsia"/>
@@ -418,11 +324,6 @@
       </w:r>
     </w:p>
     <w:p>
-      <w:pPr>
-        <w:rPr>
-          <w:rFonts w:hint="eastAsia"/>
-        </w:rPr>
-      </w:pPr>
       <w:r>
         <w:rPr>
           <w:rFonts w:hint="eastAsia"/>
@@ -437,11 +338,6 @@
       </w:r>
     </w:p>
     <w:p>
-      <w:pPr>
-        <w:rPr>
-          <w:rFonts w:hint="eastAsia"/>
-        </w:rPr>
-      </w:pPr>
       <w:r>
         <w:rPr>
           <w:rFonts w:hint="eastAsia"/>
@@ -470,11 +366,6 @@
       </w:r>
     </w:p>
     <w:p>
-      <w:pPr>
-        <w:rPr>
-          <w:rFonts w:hint="eastAsia"/>
-        </w:rPr>
-      </w:pPr>
       <w:r>
         <w:rPr>
           <w:rFonts w:hint="eastAsia"/>
@@ -500,6 +391,83 @@
           <w:rFonts w:hint="eastAsia"/>
         </w:rPr>
         <w:t>从远程拉取最新代码</w:t>
+      </w:r>
+    </w:p>
+    <w:p/>
+    <w:p/>
+    <w:p>
+      <w:r>
+        <w:t>Api:</w:t>
+      </w:r>
+    </w:p>
+    <w:p/>
+    <w:p>
+      <w:r>
+        <w:t xml:space="preserve">1 </w:t>
+      </w:r>
+      <w:proofErr w:type="spellStart"/>
+      <w:r>
+        <w:t>api</w:t>
+      </w:r>
+      <w:proofErr w:type="spellEnd"/>
+      <w:r>
+        <w:t xml:space="preserve"> to submit request from frontend to backend-post</w:t>
+      </w:r>
+    </w:p>
+    <w:p>
+      <w:r>
+        <w:t xml:space="preserve">1 </w:t>
+      </w:r>
+      <w:proofErr w:type="spellStart"/>
+      <w:r>
+        <w:t>api</w:t>
+      </w:r>
+      <w:proofErr w:type="spellEnd"/>
+      <w:r>
+        <w:t xml:space="preserve"> to get care plan from backend-get</w:t>
+      </w:r>
+    </w:p>
+    <w:p/>
+    <w:p>
+      <w:r>
+        <w:t>What to post? Input?</w:t>
+      </w:r>
+    </w:p>
+    <w:p>
+      <w:r>
+        <w:t>Get- care plan</w:t>
+      </w:r>
+    </w:p>
+    <w:p/>
+    <w:p>
+      <w:r>
+        <w:t>Walkthrough the process:</w:t>
+      </w:r>
+    </w:p>
+    <w:p>
+      <w:r>
+        <w:t xml:space="preserve">Pharmacist- input patient info- post/ </w:t>
+      </w:r>
+      <w:proofErr w:type="spellStart"/>
+      <w:r>
+        <w:t>api</w:t>
+      </w:r>
+      <w:proofErr w:type="spellEnd"/>
+      <w:r>
+        <w:t>/order to backend-show care plan</w:t>
+      </w:r>
+    </w:p>
+    <w:p>
+      <w:r>
+        <w:t>Review-get-</w:t>
+      </w:r>
+      <w:proofErr w:type="spellStart"/>
+      <w:r>
+        <w:t>api</w:t>
+      </w:r>
+      <w:proofErr w:type="spellEnd"/>
+      <w:r>
+        <w:t>/order num-show care plan</w:t>
       </w:r>
     </w:p>
     <w:sectPr>

</xml_diff>